<commit_message>
add terms the work
</commit_message>
<xml_diff>
--- a/docs/Project_self-peer-assessment_updated.docx
+++ b/docs/Project_self-peer-assessment_updated.docx
@@ -303,7 +303,37 @@
           <w:color w:val="000000" w:themeColor="text1"/>
           <w:lang w:val="en-AU"/>
         </w:rPr>
-        <w:t>Your Name: __________________ Student ID: _______________</w:t>
+        <w:t xml:space="preserve">Your Name: </w:t>
+      </w:r>
+      <w:r>
+        <w:rPr>
+          <w:rFonts w:ascii="Times New Roman" w:hAnsi="Times New Roman" w:cs="Times New Roman"/>
+          <w:b/>
+          <w:bCs/>
+          <w:color w:val="000000" w:themeColor="text1"/>
+          <w:lang w:val="en-AU"/>
+        </w:rPr>
+        <w:t>thiago honorato ferreira</w:t>
+      </w:r>
+      <w:r>
+        <w:rPr>
+          <w:rFonts w:ascii="Times New Roman" w:hAnsi="Times New Roman" w:cs="Times New Roman"/>
+          <w:b/>
+          <w:bCs/>
+          <w:color w:val="000000" w:themeColor="text1"/>
+          <w:lang w:val="en-AU"/>
+        </w:rPr>
+        <w:t xml:space="preserve"> Student ID: </w:t>
+      </w:r>
+      <w:r>
+        <w:rPr>
+          <w:rFonts w:ascii="Times New Roman" w:hAnsi="Times New Roman" w:cs="Times New Roman"/>
+          <w:b/>
+          <w:bCs/>
+          <w:color w:val="000000" w:themeColor="text1"/>
+          <w:lang w:val="en-AU"/>
+        </w:rPr>
+        <w:t>p2627421</w:t>
       </w:r>
     </w:p>
     <w:p>
@@ -677,6 +707,16 @@
                 <w:lang w:val="en-AU"/>
               </w:rPr>
             </w:pPr>
+            <w:r>
+              <w:rPr>
+                <w:rFonts w:ascii="Times New Roman" w:hAnsi="Times New Roman" w:cs="Times New Roman"/>
+                <w:b/>
+                <w:bCs/>
+                <w:color w:val="000000" w:themeColor="text1"/>
+                <w:lang w:val="en-AU"/>
+              </w:rPr>
+              <w:t>4</w:t>
+            </w:r>
           </w:p>
         </w:tc>
         <w:tc>
@@ -765,6 +805,16 @@
                 <w:lang w:val="en-AU"/>
               </w:rPr>
             </w:pPr>
+            <w:r>
+              <w:rPr>
+                <w:rFonts w:ascii="Times New Roman" w:hAnsi="Times New Roman" w:cs="Times New Roman"/>
+                <w:b/>
+                <w:bCs/>
+                <w:color w:val="000000" w:themeColor="text1"/>
+                <w:lang w:val="en-AU"/>
+              </w:rPr>
+              <w:t>5</w:t>
+            </w:r>
           </w:p>
         </w:tc>
         <w:tc>
@@ -871,6 +921,16 @@
                 <w:lang w:val="en-AU"/>
               </w:rPr>
             </w:pPr>
+            <w:r>
+              <w:rPr>
+                <w:rFonts w:ascii="Times New Roman" w:hAnsi="Times New Roman" w:cs="Times New Roman"/>
+                <w:b/>
+                <w:bCs/>
+                <w:color w:val="000000" w:themeColor="text1"/>
+                <w:lang w:val="en-AU"/>
+              </w:rPr>
+              <w:t>5</w:t>
+            </w:r>
           </w:p>
         </w:tc>
         <w:tc>
@@ -959,6 +1019,16 @@
                 <w:lang w:val="en-AU"/>
               </w:rPr>
             </w:pPr>
+            <w:r>
+              <w:rPr>
+                <w:rFonts w:ascii="Times New Roman" w:hAnsi="Times New Roman" w:cs="Times New Roman"/>
+                <w:b/>
+                <w:bCs/>
+                <w:color w:val="000000" w:themeColor="text1"/>
+                <w:lang w:val="en-AU"/>
+              </w:rPr>
+              <w:t>4</w:t>
+            </w:r>
           </w:p>
         </w:tc>
         <w:tc>
@@ -1047,6 +1117,16 @@
                 <w:lang w:val="en-AU"/>
               </w:rPr>
             </w:pPr>
+            <w:r>
+              <w:rPr>
+                <w:rFonts w:ascii="Times New Roman" w:hAnsi="Times New Roman" w:cs="Times New Roman"/>
+                <w:b/>
+                <w:bCs/>
+                <w:color w:val="000000" w:themeColor="text1"/>
+                <w:lang w:val="en-AU"/>
+              </w:rPr>
+              <w:t>3</w:t>
+            </w:r>
           </w:p>
         </w:tc>
         <w:tc>
@@ -1158,6 +1238,16 @@
                 <w:lang w:val="en-AU"/>
               </w:rPr>
             </w:pPr>
+            <w:r>
+              <w:rPr>
+                <w:rFonts w:ascii="Times New Roman" w:hAnsi="Times New Roman" w:cs="Times New Roman"/>
+                <w:b/>
+                <w:bCs/>
+                <w:color w:val="000000" w:themeColor="text1"/>
+                <w:lang w:val="en-AU"/>
+              </w:rPr>
+              <w:t>4</w:t>
+            </w:r>
           </w:p>
         </w:tc>
         <w:tc>
@@ -2286,6 +2376,12 @@
                 <w:rFonts w:ascii="Times New Roman" w:hAnsi="Times New Roman" w:cs="Times New Roman"/>
               </w:rPr>
             </w:pPr>
+            <w:r>
+              <w:rPr>
+                <w:rFonts w:ascii="Times New Roman" w:hAnsi="Times New Roman" w:cs="Times New Roman"/>
+              </w:rPr>
+              <w:t>Marcelo</w:t>
+            </w:r>
           </w:p>
         </w:tc>
         <w:tc>
@@ -2303,6 +2399,12 @@
                 <w:rFonts w:ascii="Times New Roman" w:hAnsi="Times New Roman" w:cs="Times New Roman"/>
               </w:rPr>
             </w:pPr>
+            <w:r>
+              <w:rPr>
+                <w:rFonts w:ascii="Times New Roman" w:hAnsi="Times New Roman" w:cs="Times New Roman"/>
+              </w:rPr>
+              <w:t>3</w:t>
+            </w:r>
           </w:p>
         </w:tc>
         <w:tc>
@@ -2317,6 +2419,12 @@
                 <w:rFonts w:ascii="Times New Roman" w:hAnsi="Times New Roman" w:cs="Times New Roman"/>
               </w:rPr>
             </w:pPr>
+            <w:r>
+              <w:rPr>
+                <w:rFonts w:ascii="Times New Roman" w:hAnsi="Times New Roman" w:cs="Times New Roman"/>
+              </w:rPr>
+              <w:t>3</w:t>
+            </w:r>
           </w:p>
         </w:tc>
         <w:tc>
@@ -2331,6 +2439,12 @@
                 <w:rFonts w:ascii="Times New Roman" w:hAnsi="Times New Roman" w:cs="Times New Roman"/>
               </w:rPr>
             </w:pPr>
+            <w:r>
+              <w:rPr>
+                <w:rFonts w:ascii="Times New Roman" w:hAnsi="Times New Roman" w:cs="Times New Roman"/>
+              </w:rPr>
+              <w:t>3</w:t>
+            </w:r>
           </w:p>
         </w:tc>
         <w:tc>
@@ -2345,6 +2459,12 @@
                 <w:rFonts w:ascii="Times New Roman" w:hAnsi="Times New Roman" w:cs="Times New Roman"/>
               </w:rPr>
             </w:pPr>
+            <w:r>
+              <w:rPr>
+                <w:rFonts w:ascii="Times New Roman" w:hAnsi="Times New Roman" w:cs="Times New Roman"/>
+              </w:rPr>
+              <w:t>3</w:t>
+            </w:r>
           </w:p>
         </w:tc>
         <w:tc>
@@ -2359,6 +2479,12 @@
                 <w:rFonts w:ascii="Times New Roman" w:hAnsi="Times New Roman" w:cs="Times New Roman"/>
               </w:rPr>
             </w:pPr>
+            <w:r>
+              <w:rPr>
+                <w:rFonts w:ascii="Times New Roman" w:hAnsi="Times New Roman" w:cs="Times New Roman"/>
+              </w:rPr>
+              <w:t>3</w:t>
+            </w:r>
           </w:p>
         </w:tc>
       </w:tr>
@@ -2383,6 +2509,12 @@
                 <w:rFonts w:ascii="Times New Roman" w:hAnsi="Times New Roman" w:cs="Times New Roman"/>
               </w:rPr>
             </w:pPr>
+            <w:r>
+              <w:rPr>
+                <w:rFonts w:ascii="Times New Roman" w:hAnsi="Times New Roman" w:cs="Times New Roman"/>
+              </w:rPr>
+              <w:t>Joao</w:t>
+            </w:r>
           </w:p>
           <w:p>
             <w:pPr>
@@ -2407,6 +2539,12 @@
                 <w:rFonts w:ascii="Times New Roman" w:hAnsi="Times New Roman" w:cs="Times New Roman"/>
               </w:rPr>
             </w:pPr>
+            <w:r>
+              <w:rPr>
+                <w:rFonts w:ascii="Times New Roman" w:hAnsi="Times New Roman" w:cs="Times New Roman"/>
+              </w:rPr>
+              <w:t>4</w:t>
+            </w:r>
           </w:p>
         </w:tc>
         <w:tc>
@@ -2421,6 +2559,12 @@
                 <w:rFonts w:ascii="Times New Roman" w:hAnsi="Times New Roman" w:cs="Times New Roman"/>
               </w:rPr>
             </w:pPr>
+            <w:r>
+              <w:rPr>
+                <w:rFonts w:ascii="Times New Roman" w:hAnsi="Times New Roman" w:cs="Times New Roman"/>
+              </w:rPr>
+              <w:t>4</w:t>
+            </w:r>
           </w:p>
         </w:tc>
         <w:tc>
@@ -2435,6 +2579,12 @@
                 <w:rFonts w:ascii="Times New Roman" w:hAnsi="Times New Roman" w:cs="Times New Roman"/>
               </w:rPr>
             </w:pPr>
+            <w:r>
+              <w:rPr>
+                <w:rFonts w:ascii="Times New Roman" w:hAnsi="Times New Roman" w:cs="Times New Roman"/>
+              </w:rPr>
+              <w:t>3</w:t>
+            </w:r>
           </w:p>
         </w:tc>
         <w:tc>
@@ -2449,6 +2599,12 @@
                 <w:rFonts w:ascii="Times New Roman" w:hAnsi="Times New Roman" w:cs="Times New Roman"/>
               </w:rPr>
             </w:pPr>
+            <w:r>
+              <w:rPr>
+                <w:rFonts w:ascii="Times New Roman" w:hAnsi="Times New Roman" w:cs="Times New Roman"/>
+              </w:rPr>
+              <w:t>3</w:t>
+            </w:r>
           </w:p>
         </w:tc>
         <w:tc>
@@ -2463,6 +2619,12 @@
                 <w:rFonts w:ascii="Times New Roman" w:hAnsi="Times New Roman" w:cs="Times New Roman"/>
               </w:rPr>
             </w:pPr>
+            <w:r>
+              <w:rPr>
+                <w:rFonts w:ascii="Times New Roman" w:hAnsi="Times New Roman" w:cs="Times New Roman"/>
+              </w:rPr>
+              <w:t>3,5</w:t>
+            </w:r>
           </w:p>
         </w:tc>
       </w:tr>

</xml_diff>